<commit_message>
feat: Implementar endpoint de SignIn (Inicio de sesión) - Agregar función signin en authController - Validar email y contraseña - Verificar usuario existe en base de datos - Comparar password hasheado con bcrypt - Generar token JWT en login exitoso - Mensajes de error diferenciados:   * Email no registrado   * Contraseña incorrecta - Ruta POST /api/auth/signin funcional - Probado exitosamente con usuarios de prueba - Integración lista para frontend de Gepeto
</commit_message>
<xml_diff>
--- a/UBICACION APP TERMINAL.docx
+++ b/UBICACION APP TERMINAL.docx
@@ -4,12 +4,85 @@
   <w:body>
     <w:p>
       <w:r>
-        <w:t>cd C:\Users\LENOVO\Downloads\dennis\AM</w:t>
+        <w:t>cd C:\Users\LENOVO\Downloads\dennis\AMPLIFY\amplify-frontend</w:t>
+      </w:r>
+    </w:p>
+    <w:p/>
+    <w:p>
+      <w:r>
+        <w:rPr>
+          <w:rStyle w:val="token"/>
+          <w:color w:val="B34A00"/>
+        </w:rPr>
+        <w:t>cd</w:t>
+      </w:r>
+      <w:r>
+        <w:t xml:space="preserve"> C:</w:t>
+      </w:r>
+      <w:r>
+        <w:rPr>
+          <w:rStyle w:val="token"/>
+          <w:color w:val="2B303B"/>
+        </w:rPr>
+        <w:t>\</w:t>
+      </w:r>
+      <w:r>
+        <w:t>Users</w:t>
+      </w:r>
+      <w:r>
+        <w:rPr>
+          <w:rStyle w:val="token"/>
+          <w:color w:val="2B303B"/>
+        </w:rPr>
+        <w:t>\</w:t>
+      </w:r>
+      <w:r>
+        <w:t>LENOVO</w:t>
+      </w:r>
+      <w:r>
+        <w:rPr>
+          <w:rStyle w:val="token"/>
+          <w:color w:val="2B303B"/>
+        </w:rPr>
+        <w:t>\</w:t>
+      </w:r>
+      <w:r>
+        <w:t>Downloads</w:t>
+      </w:r>
+      <w:r>
+        <w:rPr>
+          <w:rStyle w:val="token"/>
+          <w:color w:val="2B303B"/>
+        </w:rPr>
+        <w:t>\</w:t>
+      </w:r>
+      <w:r>
+        <w:t>de</w:t>
       </w:r>
       <w:bookmarkStart w:id="0" w:name="_GoBack"/>
       <w:bookmarkEnd w:id="0"/>
       <w:r>
-        <w:t>PLIFY\amplify-frontend</w:t>
+        <w:t>nnis</w:t>
+      </w:r>
+      <w:r>
+        <w:rPr>
+          <w:rStyle w:val="token"/>
+          <w:color w:val="2B303B"/>
+        </w:rPr>
+        <w:t>\</w:t>
+      </w:r>
+      <w:r>
+        <w:t>AMPLIFY</w:t>
+      </w:r>
+      <w:r>
+        <w:rPr>
+          <w:rStyle w:val="token"/>
+          <w:color w:val="2B303B"/>
+        </w:rPr>
+        <w:t>\</w:t>
+      </w:r>
+      <w:r>
+        <w:t>backend</w:t>
       </w:r>
     </w:p>
     <w:sectPr>
@@ -447,6 +520,11 @@
     <w:semiHidden/>
     <w:unhideWhenUsed/>
   </w:style>
+  <w:style w:type="character" w:customStyle="1" w:styleId="token">
+    <w:name w:val="token"/>
+    <w:basedOn w:val="Fuentedeprrafopredeter"/>
+    <w:rsid w:val="004E1224"/>
+  </w:style>
 </w:styles>
 </file>
 

</xml_diff>